<commit_message>
Update PPM report to match Gartner APMR MQ 3.8.2026 (ID G00842775)
- Alle nicht belegten "ServiceNow SPM Pro als Leader im SPM MQ 2024/25"-Aussagen entfernt
- Neuer Abschnitt: Warum ServiceNow im APMR MQ per Ausschlussregel nicht enthalten ist
  (Zitat Gartner: ITSM/ERP-Plattform-Vendors sind ausgeschlossen)
- Planisware-Steckbrief präzisiert:
  * Kernprodukt "Planisware Orchestra", AI-Agent "Oscar"
  * Gartner-Stärken und -Cautions wörtlich aus MQ übernommen
- Referenz-/Quellenangabe auf 3.8.2026, ID G00842775, Autoren erweitert
- Fazit ergänzt: Nicht-Enthaltensein von SNOW im MQ ist keine Qualitätsaussage,
  sondern Marktabgrenzung — für STIHL-Kontext der springende Punkt

Co-Authored-By: Claude Opus 4.7 (1M context) <noreply@anthropic.com>
Claude-Session: https://claude.ai/code/session_01LHT5XH22iGwBp6Qpehaznw
</commit_message>
<xml_diff>
--- a/2026_10_15_PPM_Vergleich_SNOW_Planisware.docx
+++ b/2026_10_15_PPM_Vergleich_SNOW_Planisware.docx
@@ -37,7 +37,7 @@
           <w:color w:val="4B5563"/>
           <w:sz w:val="20"/>
         </w:rPr>
-        <w:t>Kontext: Gartner Magic Quadrant für Adaptive Project Management and Reporting (Juni 2026)  ·  Fokus: Projekt-Management-Fähigkeiten  ·  Empfehlung für Migration von altem PM-Tool</w:t>
+        <w:t>Referenz: Gartner Magic Quadrant for Adaptive Project Management and Reporting (APMR), 3. August 2026, ID G00842775  ·  Fokus: Projekt-Management-Fähigkeiten im STIHL-Kontext</w:t>
       </w:r>
     </w:p>
     <w:p>
@@ -72,7 +72,21 @@
           <w:i w:val="0"/>
           <w:sz w:val="22"/>
         </w:rPr>
-        <w:t>Planisware ist der Gartner-Leader mit der höchsten „Completeness of Vision" und die technische Referenz für tiefe Engineering-/R&amp;D-Projekte (Stage-Gate, PEP). ServiceNow SPM Pro liegt im reinen Projekt-Management-Kern etwas dahinter, gewinnt aber durch Plattform-Integration, KI (Now Assist) und App-Engine-Extensibility deutlich an Boden — und ist ein Leader im SPM-Quadranten (2024/2025).</w:t>
+        <w:t>Planisware wird im aktuellen Gartner APMR Magic Quadrant (3. August 2026) als Leader geführt — mit Planisware Orchestra als Kernprodukt und dem AI-Agent Oscar für Portfolio- und Projektmanagement-Aufgaben. Gartner attestiert Planisware ein starkes „Market Understanding" und eine belastbare Post-IPO-Stabilität.</w:t>
+      </w:r>
+    </w:p>
+    <w:p>
+      <w:pPr>
+        <w:spacing w:after="160"/>
+      </w:pPr>
+      <w:r>
+        <w:rPr>
+          <w:rFonts w:ascii="Calibri" w:hAnsi="Calibri"/>
+          <w:b w:val="0"/>
+          <w:i w:val="0"/>
+          <w:sz w:val="22"/>
+        </w:rPr>
+        <w:t>ServiceNow SPM Pro wird im APMR Magic Quadrant nicht bewertet — nicht wegen fehlender Qualität, sondern per Gartner-Ausschlussregel: Plattform-Vendors, die APMR als Modul ihrer Basis-Plattform anbieten, sind vom APMR-MQ ausgeschlossen. Für STIHL ist genau dieser Plattform-Charakter der entscheidende Vorteil.</w:t>
       </w:r>
     </w:p>
     <w:p>
@@ -86,7 +100,7 @@
           <w:i w:val="0"/>
           <w:sz w:val="22"/>
         </w:rPr>
-        <w:t>Für ein Unternehmen mit bestehender ServiceNow-Basis und aktivem SPM Demand-Management ist die klare Empfehlung: ServiceNow SPM Pro als strategische Ziel-Plattform, ergänzt durch App Engine für spezifische Prozesse (z.B. Stage-Gate-PEP). Planisware bleibt als Hedge-Option für den tiefsten R&amp;D-Engineering-Bereich denkbar, ist aber wirtschaftlich meist unterlegen.</w:t>
+        <w:t>Für ein Unternehmen mit bestehender ServiceNow-Basis und aktivem SPM Demand-Management ist die Empfehlung: ServiceNow SPM Pro als strategische Ziel-Plattform, ergänzt durch App Engine für spezifische Prozesse (z.B. Stage-Gate-PEP im Bereich Entwicklung Waldwirtschaft, EWW). Planisware bleibt als Hedge-Option für den engen R&amp;D-Bereich denkbar, ist aber wirtschaftlich meist unterlegen.</w:t>
       </w:r>
     </w:p>
     <w:tbl>
@@ -129,13 +143,120 @@
                 <w:rFonts w:ascii="Calibri" w:hAnsi="Calibri"/>
                 <w:sz w:val="21"/>
               </w:rPr>
-              <w:t>ServiceNow SPM Pro empfohlen — Datenkontinuität, Betriebskontinuität und Time-to-Value überwiegen deutlich die Funktionsvorteile des spezialisierten Engineering-PM-Tools.</w:t>
+              <w:t>ServiceNow SPM Pro empfohlen — Datenkontinuität, Betriebskontinuität und Time-to-Value überwiegen deutlich die Funktionsvorteile des spezialisierten Best-of-Breed-Tools.</w:t>
             </w:r>
           </w:p>
         </w:tc>
       </w:tr>
     </w:tbl>
     <w:p/>
+    <w:p>
+      <w:pPr>
+        <w:spacing w:before="360" w:after="120"/>
+      </w:pPr>
+      <w:r>
+        <w:rPr>
+          <w:rFonts w:ascii="Calibri" w:hAnsi="Calibri"/>
+          <w:b/>
+          <w:color w:val="F07F12"/>
+          <w:sz w:val="40"/>
+        </w:rPr>
+        <w:t>Einordnung: Warum ServiceNow im APMR MQ fehlt</w:t>
+      </w:r>
+    </w:p>
+    <w:p>
+      <w:pPr>
+        <w:spacing w:after="160"/>
+      </w:pPr>
+      <w:r>
+        <w:rPr>
+          <w:rFonts w:ascii="Calibri" w:hAnsi="Calibri"/>
+          <w:b w:val="0"/>
+          <w:i w:val="0"/>
+          <w:sz w:val="22"/>
+        </w:rPr>
+        <w:t>Der Gartner APMR Magic Quadrant bewertet 11 Vendors: Asana, monday.com, Planforge, Planisware, Planview, Prism PPM, ProSymmetry, Smartsheet, Triskell, Uppwise und Wrike. ServiceNow ist bewusst nicht enthalten.</w:t>
+      </w:r>
+    </w:p>
+    <w:p>
+      <w:pPr>
+        <w:spacing w:after="80"/>
+      </w:pPr>
+      <w:r>
+        <w:rPr>
+          <w:rFonts w:ascii="Calibri" w:hAnsi="Calibri"/>
+          <w:b w:val="0"/>
+          <w:i w:val="0"/>
+          <w:sz w:val="22"/>
+        </w:rPr>
+        <w:t>Wörtliches Exclusion Criterion des Gartner-Berichts (Seite 17):</w:t>
+      </w:r>
+    </w:p>
+    <w:tbl>
+      <w:tblPr>
+        <w:tblW w:type="auto" w:w="0"/>
+        <w:jc w:val="center"/>
+        <w:tblLayout w:type="fixed"/>
+        <w:tblLook w:firstColumn="1" w:firstRow="1" w:lastColumn="0" w:lastRow="0" w:noHBand="0" w:noVBand="1" w:val="04A0"/>
+      </w:tblPr>
+      <w:tblGrid>
+        <w:gridCol w:w="9638"/>
+      </w:tblGrid>
+      <w:tr>
+        <w:tc>
+          <w:tcPr>
+            <w:tcW w:type="dxa" w:w="9972"/>
+            <w:shd w:val="clear" w:color="auto" w:fill="EEF1F4"/>
+            <w:tcBorders>
+              <w:top w:val="single" w:sz="2" w:color="808080"/>
+              <w:left w:val="single" w:sz="2" w:color="808080"/>
+              <w:bottom w:val="single" w:sz="2" w:color="808080"/>
+              <w:right w:val="single" w:sz="2" w:color="808080"/>
+            </w:tcBorders>
+          </w:tcPr>
+          <w:p>
+            <w:r/>
+            <w:r>
+              <w:rPr>
+                <w:rFonts w:ascii="Calibri" w:hAnsi="Calibri"/>
+                <w:b/>
+                <w:sz w:val="24"/>
+              </w:rPr>
+              <w:t>📖 Zitat Gartner APMR MQ</w:t>
+              <w:br/>
+            </w:r>
+          </w:p>
+          <w:p>
+            <w:r>
+              <w:rPr>
+                <w:rFonts w:ascii="Calibri" w:hAnsi="Calibri"/>
+                <w:sz w:val="21"/>
+              </w:rPr>
+              <w:t>„ERP, ITSM, SFA and other similar platform vendors that offer APMR extensions or modules from their base platforms are not included."</w:t>
+              <w:br/>
+              <w:br/>
+              <w:t>Übersetzt: ServiceNow ist als ITSM-Plattform mit APMR-Modul (SPM Pro) per Definition kein reiner APMR-Player und wird deshalb im MQ nicht gewertet.</w:t>
+            </w:r>
+          </w:p>
+        </w:tc>
+      </w:tr>
+    </w:tbl>
+    <w:p/>
+    <w:p>
+      <w:pPr>
+        <w:spacing w:after="240"/>
+      </w:pPr>
+      <w:r>
+        <w:rPr>
+          <w:rFonts w:ascii="Calibri" w:hAnsi="Calibri"/>
+          <w:b w:val="0"/>
+          <w:i/>
+          <w:color w:val="4B5563"/>
+          <w:sz w:val="22"/>
+        </w:rPr>
+        <w:t>Für den STIHL-Kontext ist das kein Nachteil — im Gegenteil: wir suchen genau den Plattform-Effekt (Integration mit ITSM, HR-SD, GRC, App Engine). Reine APMR-Best-of-Breed-Tools wie Planisware bieten diese Integration definitionsgemäß nicht.</w:t>
+      </w:r>
+    </w:p>
     <w:p>
       <w:pPr>
         <w:spacing w:before="360" w:after="120"/>
@@ -161,7 +282,7 @@
           <w:color w:val="2C3E50"/>
           <w:sz w:val="30"/>
         </w:rPr>
-        <w:t>🎯 Planisware — Leader mit höchster „Completeness of Vision"</w:t>
+        <w:t>🎯 Planisware — Leader im Gartner APMR MQ 2026</w:t>
       </w:r>
     </w:p>
     <w:p>
@@ -174,7 +295,7 @@
           <w:rFonts w:ascii="Calibri" w:hAnsi="Calibri"/>
           <w:sz w:val="22"/>
         </w:rPr>
-        <w:t>Referenz-Tool für Engineering-/R&amp;D-Projekte (Stage-Gate, PEP)</w:t>
+        <w:t>Kernprodukt: Planisware Orchestra (SaaS, mehrsprachig)</w:t>
       </w:r>
     </w:p>
     <w:p>
@@ -187,7 +308,7 @@
           <w:rFonts w:ascii="Calibri" w:hAnsi="Calibri"/>
           <w:sz w:val="22"/>
         </w:rPr>
-        <w:t>Kernstärken: Produktentwicklung, komplexe Ressourcen×Finanz-Verzahnung, Portfolio-Simulationen</w:t>
+        <w:t>AI-Agent Oscar: Demand Management, Szenario-Planung, Natural Language Queries, automatisierte Statusberichte</w:t>
       </w:r>
     </w:p>
     <w:p>
@@ -200,7 +321,7 @@
           <w:rFonts w:ascii="Calibri" w:hAnsi="Calibri"/>
           <w:sz w:val="22"/>
         </w:rPr>
-        <w:t>Zielgruppe: R&amp;D-getriebene Unternehmen (Automotive, Pharma, Industrie — strukturell nah an STIHL)</w:t>
+        <w:t>Gartner-Stärken laut MQ 2026: Market Understanding (Reifegrad-Skalierung von Projekt- zu Portfolio-Ebene), Marketing Strategy (out-of-the-box Dashboards), Overall Viability (Post-IPO-Stabilität, neue Präsenz in den Amerikas)</w:t>
       </w:r>
     </w:p>
     <w:p>
@@ -213,7 +334,7 @@
           <w:rFonts w:ascii="Calibri" w:hAnsi="Calibri"/>
           <w:sz w:val="22"/>
         </w:rPr>
-        <w:t>Preis-Level: sehr hoch, personell-hungrig — dedizierte Experten nötig (18–24 Monate Implementierung)</w:t>
+        <w:t>Gartner-Cautions laut MQ 2026: (1) Steile Lernkurve durch breites Feature-Set, (2) Industry-Starter-Packages decken Anforderungen nicht immer ab — Zusatzkonfiguration nötig, (3) AI-Fokus deckt evtl. nicht alle funktionalen APMR-Anforderungen</w:t>
       </w:r>
     </w:p>
     <w:p>
@@ -226,7 +347,7 @@
           <w:rFonts w:ascii="Calibri" w:hAnsi="Calibri"/>
           <w:sz w:val="22"/>
         </w:rPr>
-        <w:t>Betriebsmodell: Insellösung — kein nativer Anschluss an ITSM/HR/CSM/GRC</w:t>
+        <w:t>Betriebsmodell: Insellösung ohne nativen Anschluss an ITSM/HR/CSM/GRC</w:t>
       </w:r>
     </w:p>
     <w:p>
@@ -240,7 +361,7 @@
           <w:color w:val="2C3E50"/>
           <w:sz w:val="30"/>
         </w:rPr>
-        <w:t>🔷 ServiceNow SPM Pro — Leader im SPM Magic Quadrant (2024/2025)</w:t>
+        <w:t>🔷 ServiceNow SPM Pro — Plattform-Modul, nicht im APMR MQ bewertet</w:t>
       </w:r>
     </w:p>
     <w:p>
@@ -305,7 +426,7 @@
           <w:rFonts w:ascii="Calibri" w:hAnsi="Calibri"/>
           <w:sz w:val="22"/>
         </w:rPr>
-        <w:t>Betriebsmodell: durchgehende Plattform statt Tool-Silo</w:t>
+        <w:t>Wichtiger Kontext: Gartner-APMR-MQ schließt Plattform-Vendors wie SNOW definitorisch aus — dies ist kein Qualitätsurteil, sondern eine Marktabgrenzung</w:t>
       </w:r>
     </w:p>
     <w:p>
@@ -339,7 +460,7 @@
           <w:color w:val="4B5563"/>
           <w:sz w:val="22"/>
         </w:rPr>
-        <w:t>Die folgende Matrix vergleicht beide Player anhand von 16 Kriterien im Kontext Projekt-Management (5 Sterne = Best-in-Class).</w:t>
+        <w:t>Die folgende Matrix vergleicht beide Player anhand von 16 Kriterien im Kontext Projekt-Management (5 Sterne = Best-in-Class). Die Planisware-Bewertungen orientieren sich am Gartner APMR MQ 2026, die SNOW-Bewertungen an STIHL-Erfahrungswerten und Marktbeobachtung.</w:t>
       </w:r>
     </w:p>
     <w:tbl>
@@ -714,7 +835,7 @@
                 <w:i w:val="0"/>
                 <w:sz w:val="21"/>
               </w:rPr>
-              <w:t>Was-wäre-wenn / Szenario-Analysen</w:t>
+              <w:t>Was-wäre-wenn / Szenario-Analysen (Oscar-AI)</w:t>
             </w:r>
           </w:p>
         </w:tc>
@@ -1240,7 +1361,7 @@
                 <w:i w:val="0"/>
                 <w:sz w:val="21"/>
               </w:rPr>
-              <w:t>★★★</w:t>
+              <w:t>★★★★ (Oscar)</w:t>
             </w:r>
           </w:p>
         </w:tc>
@@ -1798,7 +1919,7 @@
           <w:color w:val="B91C1C"/>
           <w:sz w:val="24"/>
         </w:rPr>
-        <w:t>Wo Planisware technisch überlegen ist</w:t>
+        <w:t>Wo Planisware technisch überlegen ist (laut Gartner APMR MQ 2026)</w:t>
       </w:r>
     </w:p>
     <w:p>
@@ -1811,7 +1932,7 @@
           <w:rFonts w:ascii="Calibri" w:hAnsi="Calibri"/>
           <w:sz w:val="22"/>
         </w:rPr>
-        <w:t>Tiefe Stage-Gate-Prozesse für Produktentwicklung (STIHL EWW/PEP wäre hier grundsätzlich sehr gut aufgehoben)</w:t>
+        <w:t>Reife Portfolio-Ebene mit strukturierter Governance und adaptiven Controls</w:t>
       </w:r>
     </w:p>
     <w:p>
@@ -1824,7 +1945,7 @@
           <w:rFonts w:ascii="Calibri" w:hAnsi="Calibri"/>
           <w:sz w:val="22"/>
         </w:rPr>
-        <w:t>Sehr komplexe Ressourcen×Finanz×Zeit-Verschränkungen über hunderte parallele NPD-Projekte</w:t>
+        <w:t>AI-Agent Oscar mit Fokus auf Demand, Szenario-Planung, Natural Language Queries</w:t>
       </w:r>
     </w:p>
     <w:p>
@@ -1837,7 +1958,7 @@
           <w:rFonts w:ascii="Calibri" w:hAnsi="Calibri"/>
           <w:sz w:val="22"/>
         </w:rPr>
-        <w:t>Referenz-Domäne: Automotive, Aerospace, Pharma R&amp;D</w:t>
+        <w:t>Out-of-the-box Dashboards und einheitliche Datenschicht als Fundament für AI</w:t>
       </w:r>
     </w:p>
     <w:p>
@@ -1850,7 +1971,7 @@
           <w:rFonts w:ascii="Calibri" w:hAnsi="Calibri"/>
           <w:sz w:val="22"/>
         </w:rPr>
-        <w:t>Portfolio-Simulationen und Was-wäre-wenn-Analysen auf sehr großem Datenbestand</w:t>
+        <w:t>Post-IPO-Stabilität und globale Präsenz (jüngst neue Amerikas-Präsenz)</w:t>
       </w:r>
     </w:p>
     <w:p>
@@ -1863,7 +1984,7 @@
           <w:rFonts w:ascii="Calibri" w:hAnsi="Calibri"/>
           <w:sz w:val="22"/>
         </w:rPr>
-        <w:t>ABER: Insel-Betrieb, kein Anschluss an ITSM/HR/CSM, hoher Betriebs- und Trainingsaufwand</w:t>
+        <w:t>ABER laut Gartner: Steile Lernkurve, Industry-Packages oft nicht ausreichend, Insel-Betrieb ohne Anschluss an ITSM/HR/CSM</w:t>
       </w:r>
     </w:p>
     <w:p>
@@ -1890,7 +2011,7 @@
           <w:rFonts w:ascii="Calibri" w:hAnsi="Calibri"/>
           <w:sz w:val="22"/>
         </w:rPr>
-        <w:t>Plattform-Integration — Demand aus ITSM fließt direkt in Projekte</w:t>
+        <w:t>Plattform-Integration — Demand aus ITSM fließt direkt in Projekte (nativ, kein Konnektor)</w:t>
       </w:r>
     </w:p>
     <w:p>
@@ -1903,7 +2024,7 @@
           <w:rFonts w:ascii="Calibri" w:hAnsi="Calibri"/>
           <w:sz w:val="22"/>
         </w:rPr>
-        <w:t>Time-to-Value — Team, Betrieb und UI bereits bekannt</w:t>
+        <w:t>Time-to-Value — Team, Betrieb und UI im Haus seit 2014 bekannt</w:t>
       </w:r>
     </w:p>
     <w:p>
@@ -1916,7 +2037,7 @@
           <w:rFonts w:ascii="Calibri" w:hAnsi="Calibri"/>
           <w:sz w:val="22"/>
         </w:rPr>
-        <w:t>KI durchgängig — Now Assist für Reporting, Risikofrüherkennung, Story Generation</w:t>
+        <w:t>KI durchgängig — Now Assist für Reporting, Risikofrüherkennung, Story Generation über alle SNOW-Bereiche</w:t>
       </w:r>
     </w:p>
     <w:p>
@@ -1955,7 +2076,7 @@
           <w:rFonts w:ascii="Calibri" w:hAnsi="Calibri"/>
           <w:sz w:val="22"/>
         </w:rPr>
-        <w:t>ABER: in tiefstem Engineering-PM etwas weniger reif als das spezialisierte Tool</w:t>
+        <w:t>ABER: in tiefstem Engineering-PM strukturell weniger reif als das spezialisierte Best-of-Breed-Tool</w:t>
       </w:r>
     </w:p>
     <w:p>
@@ -2643,7 +2764,7 @@
           <w:color w:val="2C3E50"/>
           <w:sz w:val="24"/>
         </w:rPr>
-        <w:t>Engineering-PM-Tiefe</w:t>
+        <w:t>Engineering-PM-Tiefe (EWW / R&amp;D)</w:t>
       </w:r>
     </w:p>
     <w:p>
@@ -2657,7 +2778,7 @@
           <w:i w:val="0"/>
           <w:sz w:val="22"/>
         </w:rPr>
-        <w:t>Für die absolute Spitzentiefe im Stage-Gate-PEP (EWW) ist Planisware technisch weiter. Wenn STIHL in EWW industrialisierte Produktentwicklung mit &gt; 100 parallelen R&amp;D-Projekten hat und dort maximale Reife will → hybrider Ansatz denkbar:</w:t>
+        <w:t>Für die absolute Spitzentiefe im Stage-Gate-PEP (Bereich Entwicklung Waldwirtschaft, EWW) ist Planisware technisch weiter. Wenn STIHL in EWW industrialisierte Produktentwicklung mit &gt; 100 parallelen R&amp;D-Projekten hat und dort maximale Reife will → hybrider Ansatz denkbar:</w:t>
       </w:r>
     </w:p>
     <w:p>
@@ -2683,7 +2804,7 @@
           <w:rFonts w:ascii="Calibri" w:hAnsi="Calibri"/>
           <w:sz w:val="22"/>
         </w:rPr>
-        <w:t>Planisware (nur EWW): Deep-R&amp;D-PEP-Steuerung mit Übergabe an SNOW für Portfolio-Sicht</w:t>
+        <w:t>Planisware Orchestra (nur EWW): Deep-R&amp;D-PEP-Steuerung mit Übergabe an SNOW für Portfolio-Sicht</w:t>
       </w:r>
     </w:p>
     <w:p>
@@ -3197,7 +3318,7 @@
                 <w:rFonts w:ascii="Calibri" w:hAnsi="Calibri"/>
                 <w:sz w:val="21"/>
               </w:rPr>
-              <w:t>Nach Phase 1, wenn sich zeigt, dass App Engine PEP nicht in vernünftiger Tiefe abbildbar ist — dann Planisware als spezialisiertes Engineering-PM in Betracht ziehen. Bis dahin: Standard-First mit klarer Migration-Klausel.</w:t>
+              <w:t>Nach Phase 1, wenn sich zeigt, dass App Engine PEP nicht in vernünftiger Tiefe abbildbar ist — dann Planisware Orchestra als spezialisiertes Engineering-PM in Betracht ziehen. Bis dahin: Standard-First mit klarer Migration-Klausel.</w:t>
             </w:r>
           </w:p>
         </w:tc>
@@ -3234,6 +3355,20 @@
     </w:p>
     <w:p>
       <w:pPr>
+        <w:spacing w:after="160"/>
+      </w:pPr>
+      <w:r>
+        <w:rPr>
+          <w:rFonts w:ascii="Calibri" w:hAnsi="Calibri"/>
+          <w:b w:val="0"/>
+          <w:i w:val="0"/>
+          <w:sz w:val="22"/>
+        </w:rPr>
+        <w:t>Der Gartner APMR MQ 2026 bestätigt Planisware als Leader im reinen APMR-Markt. ServiceNow ist in diesem MQ per Ausschlussregel nicht enthalten, weil es als Plattform-Vendor mit APMR-Modul kategorisiert wird — genau die Eigenschaft, die im STIHL-Kontext den ausschlaggebenden Mehrwert liefert.</w:t>
+      </w:r>
+    </w:p>
+    <w:p>
+      <w:pPr>
         <w:spacing w:after="240"/>
       </w:pPr>
       <w:r>
@@ -3261,7 +3396,7 @@
           <w:color w:val="4B5563"/>
           <w:sz w:val="17"/>
         </w:rPr>
-        <w:t>Quellen: Gartner Magic Quadrant für Adaptive Project Management and Reporting (Juni 2026); Gartner Magic Quadrant Strategic Portfolio Management (2024/2025); Analyse basiert auf öffentlich verfügbaren Vendor-Informationen und Marktbeobachtung. Bindende Bewertung nur nach Detail-Prüfung im Rahmen des RFP-Prozesses (Vorgang 6, Q4/2026).</w:t>
+        <w:t>Quellen: Gartner Magic Quadrant for Adaptive Project Management and Reporting (APMR), 3. August 2026, ID G00842775 (Clegg, Jackson, Ali, Stang, Choi); Vendor-Aussagen zu ServiceNow SPM Pro basierend auf öffentlich verfügbaren Produktinformationen und STIHL-interner Marktbeobachtung. Bindende Bewertung nur nach Detail-Prüfung im Rahmen des RFP-Prozesses (Vorgang 6, Q4/2026).</w:t>
       </w:r>
     </w:p>
     <w:p>

</xml_diff>